<commit_message>
Funzioni: allenamenti 2–4 solo con esercizi già svolti dalla classe
- Sostituiti gli esercizi presi dalla raccolta e mai assegnati con esercizi
  delle assegnazioni per casa, dell'eserciziario svolto o della dispensa
  (qualche ripetizione fra gli allenamenti, segnalata nella fonte)
- Grafici: n. 284 (allenamento 3) e n. 285 (allenamento 4) al posto di
  343 e 344
- Allenamento 1 invariato: era già composto solo da esercizi svolti

Co-Authored-By: Claude Opus 5.5 <noreply@anthropic.com>
Claude-Session: https://claude.ai/code/session_01K678cWtnp7X6aAn8gLfvWH
</commit_message>
<xml_diff>
--- a/Compiti_Funzioni_4L/Funzioni_Allenamento_2_4L.docx
+++ b/Compiti_Funzioni_4L/Funzioni_Allenamento_2_4L.docx
@@ -222,7 +222,7 @@
           <w:i/>
           <w:iCs/>
         </w:rPr>
-        <w:t xml:space="preserve">Dal libro o dai materiali: pagg. 19–20 n. 30, 40, 48</w:t>
+        <w:t xml:space="preserve">Dal libro o dai materiali: pagg. 19–20 n. 31, 40, 48</w:t>
       </w:r>
     </w:p>
     <w:p>
@@ -263,7 +263,7 @@
         <m:f>
           <m:num>
             <m:r>
-              <m:t>x</m:t>
+              <m:t>x−1</m:t>
             </m:r>
           </m:num>
           <m:den>
@@ -281,13 +281,13 @@
               </m:sup>
             </m:sSup>
             <m:r>
-              <m:t>−4x+3</m:t>
+              <m:t>+2x+4</m:t>
             </m:r>
           </m:den>
         </m:f>
       </m:oMath>
       <w:r>
-        <w:t xml:space="preserve"> (n. 30)</w:t>
+        <w:t xml:space="preserve"> (n. 31)</w:t>
       </w:r>
     </w:p>
     <w:p>
@@ -1239,7 +1239,7 @@
           <w:i/>
           <w:iCs/>
         </w:rPr>
-        <w:t xml:space="preserve">Dal libro o dai materiali: pag. 29 n. 243</w:t>
+        <w:t xml:space="preserve">Dal libro o dai materiali: pag. 29 n. 235 (eserciziario)</w:t>
       </w:r>
     </w:p>
     <w:p>
@@ -1255,37 +1255,95 @@
         <w:t xml:space="preserve">Studia</w:t>
       </w:r>
       <w:r>
-        <w:t xml:space="preserve"> il segno di </w:t>
-      </w:r>
-      <m:oMath>
-        <m:r>
-          <m:t>y=</m:t>
+        <w:t xml:space="preserve"> zeri e segno di </w:t>
+      </w:r>
+      <m:oMath>
+        <m:r>
+          <m:t>y=−</m:t>
+        </m:r>
+        <m:sSup>
+          <m:sSupPr/>
+          <m:e>
+            <m:r>
+              <m:t>x</m:t>
+            </m:r>
+          </m:e>
+          <m:sup>
+            <m:r>
+              <m:t>2</m:t>
+            </m:r>
+          </m:sup>
+        </m:sSup>
+        <m:r>
+          <m:t>+3x−2</m:t>
+        </m:r>
+      </m:oMath>
+      <w:r>
+        <w:t xml:space="preserve">.</w:t>
+      </w:r>
+    </w:p>
+    <w:p>
+      <w:pPr>
+        <w:spacing w:after="100" w:before="0"/>
+      </w:pPr>
+    </w:p>
+    <w:p>
+      <w:pPr>
+        <w:pStyle w:val="Heading2"/>
+        <w:keepNext/>
+        <w:spacing w:after="100" w:before="200"/>
+      </w:pPr>
+      <w:r>
+        <w:t xml:space="preserve">Esercizio 9  (0,5 punti)</w:t>
+      </w:r>
+    </w:p>
+    <w:p>
+      <w:pPr>
+        <w:keepNext/>
+        <w:spacing w:after="60" w:before="0"/>
+      </w:pPr>
+      <w:r>
+        <w:rPr>
+          <w:i/>
+          <w:iCs/>
+        </w:rPr>
+        <w:t xml:space="preserve">Dal libro o dai materiali: pag. 36 n. 318</w:t>
+      </w:r>
+    </w:p>
+    <w:p>
+      <w:pPr>
+        <w:keepNext w:val="false"/>
+        <w:spacing w:after="60" w:before="0"/>
+      </w:pPr>
+      <w:r>
+        <w:rPr>
+          <w:b/>
+          <w:bCs/>
+        </w:rPr>
+        <w:t xml:space="preserve">Determina</w:t>
+      </w:r>
+      <w:r>
+        <w:t xml:space="preserve"> l’inversa di </w:t>
+      </w:r>
+      <m:oMath>
+        <m:r>
+          <m:t>f(x)=</m:t>
         </m:r>
         <m:f>
           <m:num>
             <m:r>
-              <m:t>x−6</m:t>
+              <m:t>1</m:t>
             </m:r>
           </m:num>
           <m:den>
             <m:r>
-              <m:t>4x−2</m:t>
-            </m:r>
-            <m:sSup>
-              <m:sSupPr/>
-              <m:e>
-                <m:r>
-                  <m:t>x</m:t>
-                </m:r>
-              </m:e>
-              <m:sup>
-                <m:r>
-                  <m:t>2</m:t>
-                </m:r>
-              </m:sup>
-            </m:sSup>
+              <m:t>x−2</m:t>
+            </m:r>
           </m:den>
         </m:f>
+        <m:r>
+          <m:t>−3</m:t>
+        </m:r>
       </m:oMath>
       <w:r>
         <w:t xml:space="preserve">.</w:t>
@@ -1303,7 +1361,7 @@
         <w:spacing w:after="100" w:before="200"/>
       </w:pPr>
       <w:r>
-        <w:t xml:space="preserve">Esercizio 9  (0,5 punti)</w:t>
+        <w:t xml:space="preserve">Esercizio 10  (0,5 punti)</w:t>
       </w:r>
     </w:p>
     <w:p>
@@ -1316,7 +1374,7 @@
           <w:i/>
           <w:iCs/>
         </w:rPr>
-        <w:t xml:space="preserve">Dal libro o dai materiali: pag. 36 n. 318</w:t>
+        <w:t xml:space="preserve">Dal libro o dai materiali: pag. 34 n. 298</w:t>
       </w:r>
     </w:p>
     <w:p>
@@ -1325,14 +1383,7 @@
         <w:spacing w:after="60" w:before="0"/>
       </w:pPr>
       <w:r>
-        <w:rPr>
-          <w:b/>
-          <w:bCs/>
-        </w:rPr>
-        <w:t xml:space="preserve">Determina</w:t>
-      </w:r>
-      <w:r>
-        <w:t xml:space="preserve"> l’inversa di </w:t>
+        <w:t xml:space="preserve">Date </w:t>
       </w:r>
       <m:oMath>
         <m:r>
@@ -1341,21 +1392,52 @@
         <m:f>
           <m:num>
             <m:r>
-              <m:t>1</m:t>
+              <m:t>2</m:t>
             </m:r>
           </m:num>
           <m:den>
             <m:r>
-              <m:t>x−2</m:t>
+              <m:t>x+1</m:t>
             </m:r>
           </m:den>
         </m:f>
-        <m:r>
-          <m:t>−3</m:t>
-        </m:r>
-      </m:oMath>
-      <w:r>
-        <w:t xml:space="preserve">.</w:t>
+      </m:oMath>
+      <w:r>
+        <w:t xml:space="preserve"> e </w:t>
+      </w:r>
+      <m:oMath>
+        <m:r>
+          <m:t>g(x)=2x</m:t>
+        </m:r>
+      </m:oMath>
+      <w:r>
+        <w:t xml:space="preserve">, </w:t>
+      </w:r>
+      <w:r>
+        <w:rPr>
+          <w:b/>
+          <w:bCs/>
+        </w:rPr>
+        <w:t xml:space="preserve">determina</w:t>
+      </w:r>
+      <w:r>
+        <w:t xml:space="preserve"> </w:t>
+      </w:r>
+      <m:oMath>
+        <m:r>
+          <m:t>f∘g</m:t>
+        </m:r>
+      </m:oMath>
+      <w:r>
+        <w:t xml:space="preserve"> e </w:t>
+      </w:r>
+      <m:oMath>
+        <m:r>
+          <m:t>g∘f</m:t>
+        </m:r>
+      </m:oMath>
+      <w:r>
+        <w:t xml:space="preserve"> con il loro dominio.</w:t>
       </w:r>
     </w:p>
     <w:p>
@@ -1370,7 +1452,7 @@
         <w:spacing w:after="100" w:before="200"/>
       </w:pPr>
       <w:r>
-        <w:t xml:space="preserve">Esercizio 10  (0,5 punti)</w:t>
+        <w:t xml:space="preserve">Esercizio 11  (0,5 punti)</w:t>
       </w:r>
     </w:p>
     <w:p>
@@ -1383,7 +1465,7 @@
           <w:i/>
           <w:iCs/>
         </w:rPr>
-        <w:t xml:space="preserve">Dal libro o dai materiali: pag. 34 n. 298</w:t>
+        <w:t xml:space="preserve">Dal libro o dai materiali: pag. 40 n. 352 (ripetuto)</w:t>
       </w:r>
     </w:p>
     <w:p>
@@ -1392,7 +1474,7 @@
         <w:spacing w:after="60" w:before="0"/>
       </w:pPr>
       <w:r>
-        <w:t xml:space="preserve">Date </w:t>
+        <w:t xml:space="preserve">Data </w:t>
       </w:r>
       <m:oMath>
         <m:r>
@@ -1401,40 +1483,48 @@
         <m:f>
           <m:num>
             <m:r>
-              <m:t>2</m:t>
+              <m:t>x+a</m:t>
             </m:r>
           </m:num>
           <m:den>
             <m:r>
-              <m:t>x+1</m:t>
+              <m:t>x+b</m:t>
             </m:r>
           </m:den>
         </m:f>
       </m:oMath>
       <w:r>
+        <w:t xml:space="preserve">, </w:t>
+      </w:r>
+      <w:r>
+        <w:rPr>
+          <w:b/>
+          <w:bCs/>
+        </w:rPr>
+        <w:t xml:space="preserve">determina</w:t>
+      </w:r>
+      <w:r>
+        <w:t xml:space="preserve"> </w:t>
+      </w:r>
+      <m:oMath>
+        <m:r>
+          <m:t>a</m:t>
+        </m:r>
+      </m:oMath>
+      <w:r>
         <w:t xml:space="preserve"> e </w:t>
       </w:r>
       <m:oMath>
         <m:r>
-          <m:t>g(x)=2x</m:t>
-        </m:r>
-      </m:oMath>
-      <w:r>
-        <w:t xml:space="preserve">, </w:t>
-      </w:r>
-      <w:r>
-        <w:rPr>
-          <w:b/>
-          <w:bCs/>
-        </w:rPr>
-        <w:t xml:space="preserve">determina</w:t>
-      </w:r>
-      <w:r>
-        <w:t xml:space="preserve"> </w:t>
-      </w:r>
-      <m:oMath>
-        <m:r>
-          <m:t>f∘g</m:t>
+          <m:t>b</m:t>
+        </m:r>
+      </m:oMath>
+      <w:r>
+        <w:t xml:space="preserve"> in modo che il dominio sia </w:t>
+      </w:r>
+      <m:oMath>
+        <m:r>
+          <m:t>ℝ−{−3}</m:t>
         </m:r>
       </m:oMath>
       <w:r>
@@ -1442,83 +1532,7 @@
       </w:r>
       <m:oMath>
         <m:r>
-          <m:t>g∘f</m:t>
-        </m:r>
-      </m:oMath>
-      <w:r>
-        <w:t xml:space="preserve"> con il loro dominio.</w:t>
-      </w:r>
-    </w:p>
-    <w:p>
-      <w:pPr>
-        <w:spacing w:after="100" w:before="0"/>
-      </w:pPr>
-    </w:p>
-    <w:p>
-      <w:pPr>
-        <w:pStyle w:val="Heading2"/>
-        <w:keepNext/>
-        <w:spacing w:after="100" w:before="200"/>
-      </w:pPr>
-      <w:r>
-        <w:t xml:space="preserve">Esercizio 11  (0,5 punti)</w:t>
-      </w:r>
-    </w:p>
-    <w:p>
-      <w:pPr>
-        <w:keepNext/>
-        <w:spacing w:after="60" w:before="0"/>
-      </w:pPr>
-      <w:r>
-        <w:rPr>
-          <w:i/>
-          <w:iCs/>
-        </w:rPr>
-        <w:t xml:space="preserve">Dal libro o dai materiali: pag. 31 n. 277</w:t>
-      </w:r>
-    </w:p>
-    <w:p>
-      <w:pPr>
-        <w:keepNext w:val="false"/>
-        <w:spacing w:after="60" w:before="0"/>
-      </w:pPr>
-      <w:r>
-        <w:rPr>
-          <w:b/>
-          <w:bCs/>
-        </w:rPr>
-        <w:t xml:space="preserve">Determina</w:t>
-      </w:r>
-      <w:r>
-        <w:t xml:space="preserve"> </w:t>
-      </w:r>
-      <m:oMath>
-        <m:r>
-          <m:t>a</m:t>
-        </m:r>
-      </m:oMath>
-      <w:r>
-        <w:t xml:space="preserve"> e </w:t>
-      </w:r>
-      <m:oMath>
-        <m:r>
-          <m:t>b</m:t>
-        </m:r>
-      </m:oMath>
-      <w:r>
-        <w:t xml:space="preserve"> in modo che </w:t>
-      </w:r>
-      <m:oMath>
-        <m:r>
-          <m:t>y=ax+b</m:t>
-        </m:r>
-      </m:oMath>
-      <w:r>
-        <w:t xml:space="preserve"> sia dispari e passi per </w:t>
-      </w:r>
-      <m:oMath>
-        <m:r>
-          <m:t>(−2; 6)</m:t>
+          <m:t>f(0)=6</m:t>
         </m:r>
       </m:oMath>
       <w:r>

</xml_diff>